<commit_message>
Add dark mode, landscape fixes and XAMPP database connection
- Mis citas is now a single scrolling list with sticky filters, so all
  appointments are reachable in landscape; the detail header shrinks
  when height is short, and horizontal safe-drawing insets keep content
  clear of the camera cutout.
- Dark color scheme that follows the system, with a sun/moon toggle;
  hardcoded white/navy colors replaced by theme colors.
- servidor/ holds the MySQL schema with sample data and a small PHP API
  (citas.php, cambiar_estado.php) for XAMPP. The app loads appointments
  through Ktor, saves confirm/cancel back to MySQL, falls back to sample
  data when the server is down, and lets the user change the API URL.
- Guide and README updated with the new screenshots and XAMPP setup.

Co-Authored-By: Claude Opus 5.5 <noreply@anthropic.com>
Claude-Session: https://claude.ai/code/session_01J7iu5jaDjt94VM4YVZtX4n
</commit_message>
<xml_diff>
--- a/entrega/Guia_7_Master_Detail_Vitalis_EPS.docx
+++ b/entrega/Guia_7_Master_Detail_Vitalis_EPS.docx
@@ -1374,7 +1374,7 @@
               <w:rPr>
                 <w:rFonts w:ascii="Arial" w:hAnsi="Arial" w:cs="Arial"/>
               </w:rPr>
-              <w:t xml:space="preserve">aplicación “Vitalis EPS”, para que los afiliados de una EPS ficticia gestionen sus citas médicas. Se construyó en Android Studio con Kotlin Multiplatform y Compose Multiplatform: la interfaz se escribe una sola vez y se ejecuta en Android y en escritorio (Cross Platform). Tiene tres vistas: Principal, con la información de la EPS y la próxima cita; Maestro, con la lista de citas del afiliado; y Detalle, con toda la información de la cita elegida, donde se puede confirmar o cancelar. El código fuente está en la carpeta VitalisEPS del repositorio.</w:t>
+              <w:t xml:space="preserve">aplicación “Vitalis EPS”, para que los afiliados de una EPS ficticia gestionen sus citas médicas. Se construyó en Android Studio con Kotlin Multiplatform y Compose Multiplatform: la interfaz se escribe una sola vez y se ejecuta en Android y en escritorio (Cross Platform). Tiene tres vistas: Principal, con la información de la EPS y la próxima cita; Maestro, con la lista de citas del afiliado; y Detalle, con toda la información de la cita elegida, donde se puede confirmar o cancelar. Las citas se guardan en una base de datos MySQL de XAMPP y la app las lee y actualiza a través de una API en PHP; si el servidor no está encendido, muestra datos de ejemplo. Incluye modo claro y oscuro y se adapta al celular de lado y a tablets. El código fuente está en la carpeta VitalisEPS del repositorio.</w:t>
             </w:r>
           </w:p>
           <w:p>
@@ -1795,6 +1795,198 @@
                 <w:szCs w:val="18"/>
               </w:rPr>
               <w:t xml:space="preserve">Figura 7. En pantallas anchas (tablet o escritorio) el Maestro y el Detalle se muestran lado a lado, como la MasterDetailPage/FlyoutPage de Xamarin.</w:t>
+            </w:r>
+          </w:p>
+          <w:p>
+            <w:pPr>
+              <w:spacing w:before="120" w:after="60"/>
+              <w:ind w:left="0"/>
+              <w:jc w:val="center"/>
+            </w:pPr>
+            <w:r>
+              <w:drawing>
+                <wp:inline xmlns:a="http://schemas.openxmlformats.org/drawingml/2006/main" xmlns:pic="http://schemas.openxmlformats.org/drawingml/2006/picture">
+                  <wp:extent cx="1417320" cy="3069330"/>
+                  <wp:docPr id="8" name="Picture 8"/>
+                  <wp:cNvGraphicFramePr>
+                    <a:graphicFrameLocks noChangeAspect="1"/>
+                  </wp:cNvGraphicFramePr>
+                  <a:graphic>
+                    <a:graphicData uri="http://schemas.openxmlformats.org/drawingml/2006/picture">
+                      <pic:pic>
+                        <pic:nvPicPr>
+                          <pic:cNvPr id="0" name="08_oscuro_principal.png"/>
+                          <pic:cNvPicPr/>
+                        </pic:nvPicPr>
+                        <pic:blipFill>
+                          <a:blip r:embed="rId25"/>
+                          <a:stretch>
+                            <a:fillRect/>
+                          </a:stretch>
+                        </pic:blipFill>
+                        <pic:spPr>
+                          <a:xfrm>
+                            <a:off x="0" y="0"/>
+                            <a:ext cx="1417320" cy="3069330"/>
+                          </a:xfrm>
+                          <a:prstGeom prst="rect"/>
+                        </pic:spPr>
+                      </pic:pic>
+                    </a:graphicData>
+                  </a:graphic>
+                </wp:inline>
+              </w:drawing>
+            </w:r>
+            <w:r>
+              <w:t xml:space="preserve">   </w:t>
+            </w:r>
+            <w:r>
+              <w:drawing>
+                <wp:inline xmlns:a="http://schemas.openxmlformats.org/drawingml/2006/main" xmlns:pic="http://schemas.openxmlformats.org/drawingml/2006/picture">
+                  <wp:extent cx="1417320" cy="3069330"/>
+                  <wp:docPr id="8" name="Picture 8"/>
+                  <wp:cNvGraphicFramePr>
+                    <a:graphicFrameLocks noChangeAspect="1"/>
+                  </wp:cNvGraphicFramePr>
+                  <a:graphic>
+                    <a:graphicData uri="http://schemas.openxmlformats.org/drawingml/2006/picture">
+                      <pic:pic>
+                        <pic:nvPicPr>
+                          <pic:cNvPr id="0" name="09_oscuro_maestro.png"/>
+                          <pic:cNvPicPr/>
+                        </pic:nvPicPr>
+                        <pic:blipFill>
+                          <a:blip r:embed="rId26"/>
+                          <a:stretch>
+                            <a:fillRect/>
+                          </a:stretch>
+                        </pic:blipFill>
+                        <pic:spPr>
+                          <a:xfrm>
+                            <a:off x="0" y="0"/>
+                            <a:ext cx="1417320" cy="3069330"/>
+                          </a:xfrm>
+                          <a:prstGeom prst="rect"/>
+                        </pic:spPr>
+                      </pic:pic>
+                    </a:graphicData>
+                  </a:graphic>
+                </wp:inline>
+              </w:drawing>
+            </w:r>
+            <w:r>
+              <w:t xml:space="preserve">   </w:t>
+            </w:r>
+            <w:r>
+              <w:drawing>
+                <wp:inline xmlns:a="http://schemas.openxmlformats.org/drawingml/2006/main" xmlns:pic="http://schemas.openxmlformats.org/drawingml/2006/picture">
+                  <wp:extent cx="1417320" cy="3069330"/>
+                  <wp:docPr id="8" name="Picture 8"/>
+                  <wp:cNvGraphicFramePr>
+                    <a:graphicFrameLocks noChangeAspect="1"/>
+                  </wp:cNvGraphicFramePr>
+                  <a:graphic>
+                    <a:graphicData uri="http://schemas.openxmlformats.org/drawingml/2006/picture">
+                      <pic:pic>
+                        <pic:nvPicPr>
+                          <pic:cNvPr id="0" name="10_oscuro_detalle.png"/>
+                          <pic:cNvPicPr/>
+                        </pic:nvPicPr>
+                        <pic:blipFill>
+                          <a:blip r:embed="rId27"/>
+                          <a:stretch>
+                            <a:fillRect/>
+                          </a:stretch>
+                        </pic:blipFill>
+                        <pic:spPr>
+                          <a:xfrm>
+                            <a:off x="0" y="0"/>
+                            <a:ext cx="1417320" cy="3069330"/>
+                          </a:xfrm>
+                          <a:prstGeom prst="rect"/>
+                        </pic:spPr>
+                      </pic:pic>
+                    </a:graphicData>
+                  </a:graphic>
+                </wp:inline>
+              </w:drawing>
+            </w:r>
+          </w:p>
+          <w:p>
+            <w:pPr>
+              <w:spacing w:after="200"/>
+              <w:ind w:left="0"/>
+              <w:jc w:val="center"/>
+            </w:pPr>
+            <w:r>
+              <w:rPr>
+                <w:rFonts w:ascii="Arial" w:hAnsi="Arial" w:cs="Arial"/>
+                <w:i/>
+                <w:iCs/>
+                <w:color w:val="595959"/>
+                <w:sz w:val="18"/>
+                <w:szCs w:val="18"/>
+              </w:rPr>
+              <w:t xml:space="preserve">Figuras 8 a 10. Las tres vistas en modo oscuro (sigue el tema del celular o se cambia con el botón sol/luna).</w:t>
+            </w:r>
+          </w:p>
+          <w:p>
+            <w:pPr>
+              <w:spacing w:before="120" w:after="60"/>
+              <w:ind w:left="0"/>
+              <w:jc w:val="center"/>
+            </w:pPr>
+            <w:r>
+              <w:drawing>
+                <wp:inline xmlns:a="http://schemas.openxmlformats.org/drawingml/2006/main" xmlns:pic="http://schemas.openxmlformats.org/drawingml/2006/picture">
+                  <wp:extent cx="5120640" cy="2364550"/>
+                  <wp:docPr id="8" name="Picture 8"/>
+                  <wp:cNvGraphicFramePr>
+                    <a:graphicFrameLocks noChangeAspect="1"/>
+                  </wp:cNvGraphicFramePr>
+                  <a:graphic>
+                    <a:graphicData uri="http://schemas.openxmlformats.org/drawingml/2006/picture">
+                      <pic:pic>
+                        <pic:nvPicPr>
+                          <pic:cNvPr id="0" name="11_horizontal.png"/>
+                          <pic:cNvPicPr/>
+                        </pic:nvPicPr>
+                        <pic:blipFill>
+                          <a:blip r:embed="rId28"/>
+                          <a:stretch>
+                            <a:fillRect/>
+                          </a:stretch>
+                        </pic:blipFill>
+                        <pic:spPr>
+                          <a:xfrm>
+                            <a:off x="0" y="0"/>
+                            <a:ext cx="5120640" cy="2364550"/>
+                          </a:xfrm>
+                          <a:prstGeom prst="rect"/>
+                        </pic:spPr>
+                      </pic:pic>
+                    </a:graphicData>
+                  </a:graphic>
+                </wp:inline>
+              </w:drawing>
+            </w:r>
+          </w:p>
+          <w:p>
+            <w:pPr>
+              <w:spacing w:after="200"/>
+              <w:ind w:left="0"/>
+              <w:jc w:val="center"/>
+            </w:pPr>
+            <w:r>
+              <w:rPr>
+                <w:rFonts w:ascii="Arial" w:hAnsi="Arial" w:cs="Arial"/>
+                <w:i/>
+                <w:iCs/>
+                <w:color w:val="595959"/>
+                <w:sz w:val="18"/>
+                <w:szCs w:val="18"/>
+              </w:rPr>
+              <w:t xml:space="preserve">Figura 11. Con el celular de lado: la lista de citas se desplaza completa, los filtros quedan fijos arriba y el detalle usa un encabezado más bajo.</w:t>
             </w:r>
           </w:p>
           <w:p>
@@ -5513,13 +5705,13 @@
                 <w:b/>
                 <w:bCs/>
               </w:rPr>
-              <w:t xml:space="preserve">Navegación (App.kt). </w:t>
-            </w:r>
-            <w:r>
-              <w:rPr>
-                <w:rFonts w:ascii="Arial" w:hAnsi="Arial" w:cs="Arial"/>
-              </w:rPr>
-              <w:t xml:space="preserve">Pila de navegación Principal → Maestro → Detalle con transiciones animadas; el botón Atrás del sistema regresa a la vista anterior. Con 840 dp de ancho o más (tablet o escritorio) el Maestro y el Detalle se muestran lado a lado.</w:t>
+              <w:t xml:space="preserve">Base de datos y API (carpeta servidor). </w:t>
+            </w:r>
+            <w:r>
+              <w:rPr>
+                <w:rFonts w:ascii="Arial" w:hAnsi="Arial" w:cs="Arial"/>
+              </w:rPr>
+              <w:t xml:space="preserve">El script vitalis_eps.sql crea en MySQL (XAMPP) las tablas afiliados, especialidades, profesionales, sedes, citas (maestro) y preparaciones (detalle). La API en PHP (htdocs/vitalis_api) expone citas.php, que devuelve las citas en JSON, y cambiar_estado.php, que guarda la confirmación o la cancelación con consultas preparadas (PDO). La app se conecta con Ktor; en el emulador la dirección es http://10.0.2.2/vitalis_api.</w:t>
             </w:r>
           </w:p>
           <w:p>
@@ -5542,13 +5734,13 @@
                 <w:b/>
                 <w:bCs/>
               </w:rPr>
-              <w:t xml:space="preserve">Código nativo por plataforma (expect/actual). </w:t>
-            </w:r>
-            <w:r>
-              <w:rPr>
-                <w:rFonts w:ascii="Arial" w:hAnsi="Arial" w:cs="Arial"/>
-              </w:rPr>
-              <w:t xml:space="preserve">El botón Atrás y el color de la barra de estado se implementan de forma nativa en Android, igual que se haría con el DependencyService de Xamarin.</w:t>
+              <w:t xml:space="preserve">Modo oscuro y diseño adaptable. </w:t>
+            </w:r>
+            <w:r>
+              <w:rPr>
+                <w:rFonts w:ascii="Arial" w:hAnsi="Arial" w:cs="Arial"/>
+              </w:rPr>
+              <w:t xml:space="preserve">Dos esquemas de color (claro y oscuro) que siguen el tema del sistema o se cambian con el botón sol/luna. Con el celular de lado, la vista Maestro es una sola lista desplazable y el Detalle reduce su encabezado; además se respetan los márgenes de la cámara.</w:t>
             </w:r>
           </w:p>
           <w:p>
@@ -5571,13 +5763,13 @@
                 <w:b/>
                 <w:bCs/>
               </w:rPr>
-              <w:t xml:space="preserve">Pruebas. </w:t>
-            </w:r>
-            <w:r>
-              <w:rPr>
-                <w:rFonts w:ascii="Arial" w:hAnsi="Arial" w:cs="Arial"/>
-              </w:rPr>
-              <w:t xml:space="preserve">Se ejecutó la aplicación y se revisaron las tres vistas, la búsqueda, los filtros, la navegación de ida y vuelta y el diseño de dos paneles; de ahí salen las capturas de la sección de resultados.</w:t>
+              <w:t xml:space="preserve">Navegación (App.kt). </w:t>
+            </w:r>
+            <w:r>
+              <w:rPr>
+                <w:rFonts w:ascii="Arial" w:hAnsi="Arial" w:cs="Arial"/>
+              </w:rPr>
+              <w:t xml:space="preserve">Pila de navegación Principal → Maestro → Detalle con transiciones animadas; el botón Atrás del sistema regresa a la vista anterior. Con 840 dp de ancho o más (tablet o escritorio) el Maestro y el Detalle se muestran lado a lado.</w:t>
             </w:r>
           </w:p>
           <w:p>
@@ -5593,6 +5785,64 @@
                 <w:bCs/>
               </w:rPr>
               <w:t xml:space="preserve">10. </w:t>
+            </w:r>
+            <w:r>
+              <w:rPr>
+                <w:rFonts w:ascii="Arial" w:hAnsi="Arial" w:cs="Arial"/>
+                <w:b/>
+                <w:bCs/>
+              </w:rPr>
+              <w:t xml:space="preserve">Código nativo por plataforma (expect/actual). </w:t>
+            </w:r>
+            <w:r>
+              <w:rPr>
+                <w:rFonts w:ascii="Arial" w:hAnsi="Arial" w:cs="Arial"/>
+              </w:rPr>
+              <w:t xml:space="preserve">El botón Atrás y el color de la barra de estado se implementan de forma nativa en Android, igual que se haría con el DependencyService de Xamarin.</w:t>
+            </w:r>
+          </w:p>
+          <w:p>
+            <w:pPr>
+              <w:spacing w:after="60"/>
+              <w:ind w:left="340" w:hanging="340"/>
+              <w:jc w:val="both"/>
+            </w:pPr>
+            <w:r>
+              <w:rPr>
+                <w:rFonts w:ascii="Arial" w:hAnsi="Arial" w:cs="Arial"/>
+                <w:b/>
+                <w:bCs/>
+              </w:rPr>
+              <w:t xml:space="preserve">11. </w:t>
+            </w:r>
+            <w:r>
+              <w:rPr>
+                <w:rFonts w:ascii="Arial" w:hAnsi="Arial" w:cs="Arial"/>
+                <w:b/>
+                <w:bCs/>
+              </w:rPr>
+              <w:t xml:space="preserve">Pruebas. </w:t>
+            </w:r>
+            <w:r>
+              <w:rPr>
+                <w:rFonts w:ascii="Arial" w:hAnsi="Arial" w:cs="Arial"/>
+              </w:rPr>
+              <w:t xml:space="preserve">Se ejecutó la aplicación y se revisaron las tres vistas, la búsqueda, los filtros, la navegación de ida y vuelta y el diseño de dos paneles; de ahí salen las capturas de la sección de resultados.</w:t>
+            </w:r>
+          </w:p>
+          <w:p>
+            <w:pPr>
+              <w:spacing w:after="60"/>
+              <w:ind w:left="340" w:hanging="340"/>
+              <w:jc w:val="both"/>
+            </w:pPr>
+            <w:r>
+              <w:rPr>
+                <w:rFonts w:ascii="Arial" w:hAnsi="Arial" w:cs="Arial"/>
+                <w:b/>
+                <w:bCs/>
+              </w:rPr>
+              <w:t xml:space="preserve">12. </w:t>
             </w:r>
             <w:r>
               <w:rPr>
@@ -5769,7 +6019,22 @@
                 <w:i/>
                 <w:iCs/>
               </w:rPr>
-              <w:t xml:space="preserve">The user interface is written once and shared between Android and desktop. Platform-specific parts, like the back button, use Kotlin's expect/actual mechanism, which plays the same role as Xamarin's DependencyService. Thank you.</w:t>
+              <w:t xml:space="preserve">The user interface is written once and shared between Android and desktop. Platform-specific parts, like the back button, use Kotlin's expect/actual mechanism, which plays the same role as Xamarin's DependencyService.</w:t>
+            </w:r>
+          </w:p>
+          <w:p>
+            <w:pPr>
+              <w:spacing w:after="80"/>
+              <w:ind w:left="0"/>
+              <w:jc w:val="both"/>
+            </w:pPr>
+            <w:r>
+              <w:rPr>
+                <w:rFonts w:ascii="Arial" w:hAnsi="Arial" w:cs="Arial"/>
+                <w:i/>
+                <w:iCs/>
+              </w:rPr>
+              <w:t xml:space="preserve">The appointments are stored in a MySQL database running on XAMPP. A small PHP API returns them as JSON and saves the changes, so when a patient confirms an appointment in the app, the database is updated. The app also has a dark mode and adapts to landscape phones and tablets. Thank you.</w:t>
             </w:r>
           </w:p>
           <w:p>
@@ -11066,7 +11331,7 @@
                 <w:sz w:val="18"/>
                 <w:szCs w:val="18"/>
               </w:rPr>
-              <w:t xml:space="preserve">Maestro-detalle (Master-Detail), multiplataforma (Cross Platform), Kotlin Multiplatform, Compose Multiplatform, Android Studio, navegación, LazyColumn, diseño adaptativo, expect/actual, DependencyService.</w:t>
+              <w:t xml:space="preserve">Maestro-detalle (Master-Detail), multiplataforma (Cross Platform), Kotlin Multiplatform, Compose Multiplatform, Android Studio, navegación, LazyColumn, diseño adaptativo, modo oscuro, expect/actual, DependencyService, MySQL, XAMPP, API REST, PHP.</w:t>
             </w:r>
           </w:p>
         </w:tc>

</xml_diff>

<commit_message>
Add login with roles and an admin panel
- Login screen with demo accounts; afiliados see only their own citas
- Admin panel: all citas, create citas and doctors, change status, delete
- PHP API: bcrypt passwords, 8 h session tokens, role checks per endpoint
- Offline demo mode with the same accounts when XAMPP is not running
- New screenshots and updated guide and README

Co-Authored-By: Claude Opus 5.5 <noreply@anthropic.com>
Claude-Session: https://claude.ai/code/session_01J7iu5jaDjt94VM4YVZtX4n
</commit_message>
<xml_diff>
--- a/entrega/Guia_7_Master_Detail_Vitalis_EPS.docx
+++ b/entrega/Guia_7_Master_Detail_Vitalis_EPS.docx
@@ -1374,7 +1374,7 @@
               <w:rPr>
                 <w:rFonts w:ascii="Arial" w:hAnsi="Arial" w:cs="Arial"/>
               </w:rPr>
-              <w:t xml:space="preserve">aplicación “Vitalis EPS”, para que los afiliados de una EPS ficticia gestionen sus citas médicas. Se construyó en Android Studio con Kotlin Multiplatform y Compose Multiplatform: la interfaz se escribe una sola vez y se ejecuta en Android y en escritorio (Cross Platform). Tiene tres vistas: Principal, con la información de la EPS y la próxima cita; Maestro, con la lista de citas del afiliado; y Detalle, con toda la información de la cita elegida, donde se puede confirmar o cancelar. Las citas se guardan en una base de datos MySQL de XAMPP y la app las lee y actualiza a través de una API en PHP; si el servidor no está encendido, muestra datos de ejemplo. Incluye modo claro y oscuro y se adapta al celular de lado y a tablets. El código fuente está en la carpeta VitalisEPS del repositorio.</w:t>
+              <w:t xml:space="preserve">aplicación “Vitalis EPS”, para que los afiliados de una EPS ficticia gestionen sus citas médicas. Se construyó en Android Studio con Kotlin Multiplatform y Compose Multiplatform: la interfaz se escribe una sola vez y se ejecuta en Android y en escritorio (Cross Platform). Tiene tres vistas: Principal, con la información de la EPS y la próxima cita; Maestro, con la lista de citas del afiliado; y Detalle, con toda la información de la cita elegida, donde se puede confirmar o cancelar. Las citas se guardan en una base de datos MySQL de XAMPP y la app las lee y actualiza a través de una API en PHP; si el servidor no está encendido, muestra datos de ejemplo. Tiene inicio de sesión con dos roles: el afiliado ve solo sus citas y el administrador, desde un panel, crea citas y profesionales y gestiona las de todos los afiliados. Incluye modo claro y oscuro y se adapta al celular de lado y a tablets. El código fuente está en la carpeta VitalisEPS del repositorio.</w:t>
             </w:r>
           </w:p>
           <w:p>
@@ -1991,6 +1991,139 @@
           </w:p>
           <w:p>
             <w:pPr>
+              <w:spacing w:before="120" w:after="60"/>
+              <w:ind w:left="0"/>
+              <w:jc w:val="center"/>
+            </w:pPr>
+            <w:r>
+              <w:drawing>
+                <wp:inline xmlns:a="http://schemas.openxmlformats.org/drawingml/2006/main" xmlns:pic="http://schemas.openxmlformats.org/drawingml/2006/picture">
+                  <wp:extent cx="1417320" cy="3069330"/>
+                  <wp:docPr id="8" name="Picture 8"/>
+                  <wp:cNvGraphicFramePr>
+                    <a:graphicFrameLocks noChangeAspect="1"/>
+                  </wp:cNvGraphicFramePr>
+                  <a:graphic>
+                    <a:graphicData uri="http://schemas.openxmlformats.org/drawingml/2006/picture">
+                      <pic:pic>
+                        <pic:nvPicPr>
+                          <pic:cNvPr id="0" name="12_login.png"/>
+                          <pic:cNvPicPr/>
+                        </pic:nvPicPr>
+                        <pic:blipFill>
+                          <a:blip r:embed="rId29"/>
+                          <a:stretch>
+                            <a:fillRect/>
+                          </a:stretch>
+                        </pic:blipFill>
+                        <pic:spPr>
+                          <a:xfrm>
+                            <a:off x="0" y="0"/>
+                            <a:ext cx="1417320" cy="3069330"/>
+                          </a:xfrm>
+                          <a:prstGeom prst="rect"/>
+                        </pic:spPr>
+                      </pic:pic>
+                    </a:graphicData>
+                  </a:graphic>
+                </wp:inline>
+              </w:drawing>
+            </w:r>
+            <w:r>
+              <w:t xml:space="preserve">   </w:t>
+            </w:r>
+            <w:r>
+              <w:drawing>
+                <wp:inline xmlns:a="http://schemas.openxmlformats.org/drawingml/2006/main" xmlns:pic="http://schemas.openxmlformats.org/drawingml/2006/picture">
+                  <wp:extent cx="1417320" cy="3069330"/>
+                  <wp:docPr id="8" name="Picture 8"/>
+                  <wp:cNvGraphicFramePr>
+                    <a:graphicFrameLocks noChangeAspect="1"/>
+                  </wp:cNvGraphicFramePr>
+                  <a:graphic>
+                    <a:graphicData uri="http://schemas.openxmlformats.org/drawingml/2006/picture">
+                      <pic:pic>
+                        <pic:nvPicPr>
+                          <pic:cNvPr id="0" name="13_admin.png"/>
+                          <pic:cNvPicPr/>
+                        </pic:nvPicPr>
+                        <pic:blipFill>
+                          <a:blip r:embed="rId30"/>
+                          <a:stretch>
+                            <a:fillRect/>
+                          </a:stretch>
+                        </pic:blipFill>
+                        <pic:spPr>
+                          <a:xfrm>
+                            <a:off x="0" y="0"/>
+                            <a:ext cx="1417320" cy="3069330"/>
+                          </a:xfrm>
+                          <a:prstGeom prst="rect"/>
+                        </pic:spPr>
+                      </pic:pic>
+                    </a:graphicData>
+                  </a:graphic>
+                </wp:inline>
+              </w:drawing>
+            </w:r>
+            <w:r>
+              <w:t xml:space="preserve">   </w:t>
+            </w:r>
+            <w:r>
+              <w:drawing>
+                <wp:inline xmlns:a="http://schemas.openxmlformats.org/drawingml/2006/main" xmlns:pic="http://schemas.openxmlformats.org/drawingml/2006/picture">
+                  <wp:extent cx="1417320" cy="3069330"/>
+                  <wp:docPr id="8" name="Picture 8"/>
+                  <wp:cNvGraphicFramePr>
+                    <a:graphicFrameLocks noChangeAspect="1"/>
+                  </wp:cNvGraphicFramePr>
+                  <a:graphic>
+                    <a:graphicData uri="http://schemas.openxmlformats.org/drawingml/2006/picture">
+                      <pic:pic>
+                        <pic:nvPicPr>
+                          <pic:cNvPr id="0" name="14_admin_nueva_cita.png"/>
+                          <pic:cNvPicPr/>
+                        </pic:nvPicPr>
+                        <pic:blipFill>
+                          <a:blip r:embed="rId31"/>
+                          <a:stretch>
+                            <a:fillRect/>
+                          </a:stretch>
+                        </pic:blipFill>
+                        <pic:spPr>
+                          <a:xfrm>
+                            <a:off x="0" y="0"/>
+                            <a:ext cx="1417320" cy="3069330"/>
+                          </a:xfrm>
+                          <a:prstGeom prst="rect"/>
+                        </pic:spPr>
+                      </pic:pic>
+                    </a:graphicData>
+                  </a:graphic>
+                </wp:inline>
+              </w:drawing>
+            </w:r>
+          </w:p>
+          <w:p>
+            <w:pPr>
+              <w:spacing w:after="200"/>
+              <w:ind w:left="0"/>
+              <w:jc w:val="center"/>
+            </w:pPr>
+            <w:r>
+              <w:rPr>
+                <w:rFonts w:ascii="Arial" w:hAnsi="Arial" w:cs="Arial"/>
+                <w:i/>
+                <w:iCs/>
+                <w:color w:val="595959"/>
+                <w:sz w:val="18"/>
+                <w:szCs w:val="18"/>
+              </w:rPr>
+              <w:t xml:space="preserve">Figuras 12 a 14. Inicio de sesión con cuentas de prueba, panel de administración (todas las citas, con acciones por cita) y formulario para crear una cita nueva.</w:t>
+            </w:r>
+          </w:p>
+          <w:p>
+            <w:pPr>
               <w:pStyle w:val="Prrafodelista"/>
               <w:numPr>
                 <w:ilvl w:val="0"/>
@@ -2022,7 +2155,7 @@
               <w:rPr>
                 <w:rFonts w:ascii="Arial" w:hAnsi="Arial" w:cs="Arial"/>
               </w:rPr>
-              <w:t xml:space="preserve">Para la presentación se abre la carpeta VitalisEPS en Android Studio, se espera la sincronización de Gradle, se elige la configuración composeApp con un emulador o un celular conectado y se pulsa Run. Recorrido de la demostración: Principal → Ver mis citas → filtrar o buscar → tocar una cita → Detalle → Confirmar asistencia → botón Atrás del sistema (la cita aparece ahora como Confirmada en la lista).</w:t>
+              <w:t xml:space="preserve">Para la presentación se abre la carpeta VitalisEPS en Android Studio, se espera la sincronización de Gradle, se elige la configuración composeApp con un emulador o un celular conectado y se pulsa Run. Recorrido de la demostración: Principal → Iniciar sesión (afiliado 1020456789 / camilo123) → Mis citas → filtrar o buscar → tocar una cita → Detalle → Confirmar asistencia → Atrás (la cita aparece como Confirmada). Luego cerrar sesión, entrar como administrador (admin / admin123), crear una cita para el afiliado y comprobar que él la ve.</w:t>
             </w:r>
           </w:p>
           <w:p>
@@ -5734,13 +5867,13 @@
                 <w:b/>
                 <w:bCs/>
               </w:rPr>
-              <w:t xml:space="preserve">Modo oscuro y diseño adaptable. </w:t>
-            </w:r>
-            <w:r>
-              <w:rPr>
-                <w:rFonts w:ascii="Arial" w:hAnsi="Arial" w:cs="Arial"/>
-              </w:rPr>
-              <w:t xml:space="preserve">Dos esquemas de color (claro y oscuro) que siguen el tema del sistema o se cambian con el botón sol/luna. Con el celular de lado, la vista Maestro es una sola lista desplazable y el Detalle reduce su encabezado; además se respetan los márgenes de la cámara.</w:t>
+              <w:t xml:space="preserve">Inicio de sesión y roles. </w:t>
+            </w:r>
+            <w:r>
+              <w:rPr>
+                <w:rFonts w:ascii="Arial" w:hAnsi="Arial" w:cs="Arial"/>
+              </w:rPr>
+              <w:t xml:space="preserve">Las tablas usuarios y sesiones guardan las cuentas (contraseñas cifradas con bcrypt) y los tokens de sesión, que vencen a las 8 horas. login.php valida la contraseña con password_verify y cada servicio comprueba el token y el rol: el afiliado solo ve y modifica sus citas, y las funciones de administración responden 403 a quien no sea administrador. Sin servidor, la app funciona con cuentas de prueba.</w:t>
             </w:r>
           </w:p>
           <w:p>
@@ -5763,13 +5896,13 @@
                 <w:b/>
                 <w:bCs/>
               </w:rPr>
-              <w:t xml:space="preserve">Navegación (App.kt). </w:t>
-            </w:r>
-            <w:r>
-              <w:rPr>
-                <w:rFonts w:ascii="Arial" w:hAnsi="Arial" w:cs="Arial"/>
-              </w:rPr>
-              <w:t xml:space="preserve">Pila de navegación Principal → Maestro → Detalle con transiciones animadas; el botón Atrás del sistema regresa a la vista anterior. Con 840 dp de ancho o más (tablet o escritorio) el Maestro y el Detalle se muestran lado a lado.</w:t>
+              <w:t xml:space="preserve">Panel de administración (ui/PantallaAdmin.kt y ui/Formularios.kt). </w:t>
+            </w:r>
+            <w:r>
+              <w:rPr>
+                <w:rFonts w:ascii="Arial" w:hAnsi="Arial" w:cs="Arial"/>
+              </w:rPr>
+              <w:t xml:space="preserve">Lista de todas las citas con búsqueda, filtros y un menú por cita (confirmar, marcar como atendida, cancelar o eliminar), lista de profesionales por especialidad, formulario de nueva cita con calendario y reloj, y diálogo para agregar profesionales. Los datos se validan en la app y otra vez en el servidor.</w:t>
             </w:r>
           </w:p>
           <w:p>
@@ -5792,13 +5925,13 @@
                 <w:b/>
                 <w:bCs/>
               </w:rPr>
-              <w:t xml:space="preserve">Código nativo por plataforma (expect/actual). </w:t>
-            </w:r>
-            <w:r>
-              <w:rPr>
-                <w:rFonts w:ascii="Arial" w:hAnsi="Arial" w:cs="Arial"/>
-              </w:rPr>
-              <w:t xml:space="preserve">El botón Atrás y el color de la barra de estado se implementan de forma nativa en Android, igual que se haría con el DependencyService de Xamarin.</w:t>
+              <w:t xml:space="preserve">Modo oscuro y diseño adaptable. </w:t>
+            </w:r>
+            <w:r>
+              <w:rPr>
+                <w:rFonts w:ascii="Arial" w:hAnsi="Arial" w:cs="Arial"/>
+              </w:rPr>
+              <w:t xml:space="preserve">Dos esquemas de color (claro y oscuro) que siguen el tema del sistema o se cambian con el botón sol/luna. Con el celular de lado, la vista Maestro es una sola lista desplazable y el Detalle reduce su encabezado; además se respetan los márgenes de la cámara.</w:t>
             </w:r>
           </w:p>
           <w:p>
@@ -5821,13 +5954,13 @@
                 <w:b/>
                 <w:bCs/>
               </w:rPr>
-              <w:t xml:space="preserve">Pruebas. </w:t>
-            </w:r>
-            <w:r>
-              <w:rPr>
-                <w:rFonts w:ascii="Arial" w:hAnsi="Arial" w:cs="Arial"/>
-              </w:rPr>
-              <w:t xml:space="preserve">Se ejecutó la aplicación y se revisaron las tres vistas, la búsqueda, los filtros, la navegación de ida y vuelta y el diseño de dos paneles; de ahí salen las capturas de la sección de resultados.</w:t>
+              <w:t xml:space="preserve">Navegación (App.kt). </w:t>
+            </w:r>
+            <w:r>
+              <w:rPr>
+                <w:rFonts w:ascii="Arial" w:hAnsi="Arial" w:cs="Arial"/>
+              </w:rPr>
+              <w:t xml:space="preserve">Pila de navegación Principal → Maestro → Detalle con transiciones animadas; el botón Atrás del sistema regresa a la vista anterior. Con 840 dp de ancho o más (tablet o escritorio) el Maestro y el Detalle se muestran lado a lado.</w:t>
             </w:r>
           </w:p>
           <w:p>
@@ -5843,6 +5976,64 @@
                 <w:bCs/>
               </w:rPr>
               <w:t xml:space="preserve">12. </w:t>
+            </w:r>
+            <w:r>
+              <w:rPr>
+                <w:rFonts w:ascii="Arial" w:hAnsi="Arial" w:cs="Arial"/>
+                <w:b/>
+                <w:bCs/>
+              </w:rPr>
+              <w:t xml:space="preserve">Código nativo por plataforma (expect/actual). </w:t>
+            </w:r>
+            <w:r>
+              <w:rPr>
+                <w:rFonts w:ascii="Arial" w:hAnsi="Arial" w:cs="Arial"/>
+              </w:rPr>
+              <w:t xml:space="preserve">El botón Atrás y el color de la barra de estado se implementan de forma nativa en Android, igual que se haría con el DependencyService de Xamarin.</w:t>
+            </w:r>
+          </w:p>
+          <w:p>
+            <w:pPr>
+              <w:spacing w:after="60"/>
+              <w:ind w:left="340" w:hanging="340"/>
+              <w:jc w:val="both"/>
+            </w:pPr>
+            <w:r>
+              <w:rPr>
+                <w:rFonts w:ascii="Arial" w:hAnsi="Arial" w:cs="Arial"/>
+                <w:b/>
+                <w:bCs/>
+              </w:rPr>
+              <w:t xml:space="preserve">13. </w:t>
+            </w:r>
+            <w:r>
+              <w:rPr>
+                <w:rFonts w:ascii="Arial" w:hAnsi="Arial" w:cs="Arial"/>
+                <w:b/>
+                <w:bCs/>
+              </w:rPr>
+              <w:t xml:space="preserve">Pruebas. </w:t>
+            </w:r>
+            <w:r>
+              <w:rPr>
+                <w:rFonts w:ascii="Arial" w:hAnsi="Arial" w:cs="Arial"/>
+              </w:rPr>
+              <w:t xml:space="preserve">Se ejecutó la aplicación y se revisaron las tres vistas, la búsqueda, los filtros, la navegación de ida y vuelta y el diseño de dos paneles; de ahí salen las capturas de la sección de resultados.</w:t>
+            </w:r>
+          </w:p>
+          <w:p>
+            <w:pPr>
+              <w:spacing w:after="60"/>
+              <w:ind w:left="340" w:hanging="340"/>
+              <w:jc w:val="both"/>
+            </w:pPr>
+            <w:r>
+              <w:rPr>
+                <w:rFonts w:ascii="Arial" w:hAnsi="Arial" w:cs="Arial"/>
+                <w:b/>
+                <w:bCs/>
+              </w:rPr>
+              <w:t xml:space="preserve">14. </w:t>
             </w:r>
             <w:r>
               <w:rPr>
@@ -6034,7 +6225,22 @@
                 <w:i/>
                 <w:iCs/>
               </w:rPr>
-              <w:t xml:space="preserve">The appointments are stored in a MySQL database running on XAMPP. A small PHP API returns them as JSON and saves the changes, so when a patient confirms an appointment in the app, the database is updated. The app also has a dark mode and adapts to landscape phones and tablets. Thank you.</w:t>
+              <w:t xml:space="preserve">The appointments are stored in a MySQL database running on XAMPP. A small PHP API returns them as JSON and saves the changes, so when a patient confirms an appointment in the app, the database is updated.</w:t>
+            </w:r>
+          </w:p>
+          <w:p>
+            <w:pPr>
+              <w:spacing w:after="80"/>
+              <w:ind w:left="0"/>
+              <w:jc w:val="both"/>
+            </w:pPr>
+            <w:r>
+              <w:rPr>
+                <w:rFonts w:ascii="Arial" w:hAnsi="Arial" w:cs="Arial"/>
+                <w:i/>
+                <w:iCs/>
+              </w:rPr>
+              <w:t xml:space="preserve">There are two roles. A patient logs in with their ID number and only sees their own appointments. The administrator has a panel to create appointments and doctors and to manage every appointment. Passwords are stored with bcrypt, sessions use tokens that expire, and the server checks the role on every request. The app also has a dark mode and adapts to landscape phones and tablets. Thank you.</w:t>
             </w:r>
           </w:p>
           <w:p>
@@ -11331,7 +11537,7 @@
                 <w:sz w:val="18"/>
                 <w:szCs w:val="18"/>
               </w:rPr>
-              <w:t xml:space="preserve">Maestro-detalle (Master-Detail), multiplataforma (Cross Platform), Kotlin Multiplatform, Compose Multiplatform, Android Studio, navegación, LazyColumn, diseño adaptativo, modo oscuro, expect/actual, DependencyService, MySQL, XAMPP, API REST, PHP.</w:t>
+              <w:t xml:space="preserve">Maestro-detalle (Master-Detail), multiplataforma (Cross Platform), Kotlin Multiplatform, Compose Multiplatform, Android Studio, navegación, LazyColumn, diseño adaptativo, modo oscuro, expect/actual, DependencyService, MySQL, XAMPP, API REST, PHP, autenticación, roles, bcrypt.</w:t>
             </w:r>
           </w:p>
         </w:tc>

</xml_diff>